<commit_message>
Spanish Part 3: revise episodes 32-34 for continuity with 29-31
Co-Authored-By: Claude Opus 5.5 <noreply@anthropic.com>
Claude-Session: https://claude.ai/code/session_014Pwa4fJotSRvNewqVrvk7U
</commit_message>
<xml_diff>
--- a/business_es/part3/ep32_El_showroom_de_Doral.docx
+++ b/business_es/part3/ep32_El_showroom_de_Doral.docx
@@ -805,7 +805,7 @@
           <w:sz w:val="22"/>
         </w:rPr>
         <w:tab/>
-        <w:t>El precio. Pero no por metro, ¿eh? Aquí todo va por pie cuadrado. Si tú le dices «metro cuadrado» a un cliente, te mira como si le hablaras en chino.</w:t>
+        <w:t>El precio. Pero no por metro, ¿eh? Ya lo viste el martes en la obra: aquí todo va por pie cuadrado. Si tú le dices «metro cuadrado» a un cliente, te mira como si le hablaras en chino.</w:t>
       </w:r>
     </w:p>
     <w:p>
@@ -3655,7 +3655,7 @@
           <w:sz w:val="22"/>
         </w:rPr>
         <w:tab/>
-        <w:t>Cero coma cuarenta y dos. ¿Pasará el pulido?</w:t>
+        <w:t>Cero coma cuarenta y dos. ¿Pasará el semipulido? Es el favorito de Daniel.</w:t>
       </w:r>
     </w:p>
     <w:p>
@@ -7404,7 +7404,7 @@
           <w:color w:val="666666"/>
           <w:sz w:val="19"/>
         </w:rPr>
-        <w:t>7월 23일 목요일. 마이애미 서쪽의 도랄. 공장 건물과 야자수, 그리고 아침 9시인데도 벌써 숨이 막히는 더위. 대니얼의 쇼룸은 하얗게 칠한 옛 창고 건물에 있고, 파란 간판이 걸려 있다. '루이스-워커 타일 &amp; 스톤 — 1987년 창업'. 루카스와 암파로가 샘플 상자를 들고 렌터카에서 내린다.</w:t>
+        <w:t>7월 23일 목요일. 마이애미 서쪽의 도랄. 공장 건물과 야자수, 그리고 아침 9시인데도 벌써 숨이 막히는 더위. 대니얼의 쇼룸은 하얗게 칠한 옛 창고 건물에 있고, 파란 간판이 걸려 있다. '루이스-워커 타일 &amp; 스톤 — 1973년 창업'. 루카스와 암파로가 샘플 상자를 들고 렌터카에서 내린다.</w:t>
       </w:r>
     </w:p>
     <w:p>
@@ -7757,7 +7757,7 @@
           <w:sz w:val="21"/>
         </w:rPr>
         <w:tab/>
-        <w:t>가격이요. 그런데 미터 단위가 아니에요, 알죠? 여기선 전부 평방피트 단위예요. 손님한테 '제곱미터'라고 하면 중국어라도 들은 것처럼 쳐다봐요.</w:t>
+        <w:t>가격이요. 그런데 미터 단위가 아니에요, 알죠? 화요일에 현장에서 봤잖아요. 여기선 전부 평방피트 단위예요. 손님한테 '제곱미터'라고 하면 중국어라도 들은 것처럼 쳐다봐요.</w:t>
       </w:r>
     </w:p>
     <w:p>
@@ -10610,7 +10610,7 @@
           <w:sz w:val="21"/>
         </w:rPr>
         <w:tab/>
-        <w:t>0.42. 폴리싱이 통과할까요?</w:t>
+        <w:t>0.42. 반광택이 통과할까요? 대니얼이 제일 좋아하는 건데.</w:t>
       </w:r>
     </w:p>
     <w:p>
@@ -10677,7 +10677,7 @@
           <w:color w:val="1F3A5F"/>
           <w:sz w:val="20"/>
         </w:rPr>
-        <w:t>다음 화 예고 · Próximo episodio — 제33화 « Normas y resbalones » — 월요일 아침, 메들리의 시험소. 콜롬비아 출신 기술자 파트리시아 오초아가 타일에 물을 붓고 기계를 올린다. 화면에 뜬 숫자는 0.28. 기준은 0.42다. 암파로는 온다의 마리벨에게 전화를 건다.</w:t>
+        <w:t>다음 화 예고 · Próximo episodio — 제33화 « Normas y resbalones » — 월요일 아침, 메들리의 시험소. 콜롬비아 출신 기술자 파트리시아 오초아가 타일에 물을 붓고 기계를 올린다. 화면에 뜬 숫자는 0.36. 기준은 0.42다. 암파로는 온다의 마리벨에게 전화를 건다.</w:t>
       </w:r>
     </w:p>
     <w:sectPr>

</xml_diff>